<commit_message>
doc work Aug 10, 2026
</commit_message>
<xml_diff>
--- a/docs/design/Yek-Flashcard-Software-Architecture.docx
+++ b/docs/design/Yek-Flashcard-Software-Architecture.docx
@@ -83,7 +83,7 @@
         <w:rPr>
           <w:noProof/>
         </w:rPr>
-        <w:pict w14:anchorId="7932ADAA">
+        <w:pict w14:anchorId="360C2E43">
           <v:rect id="_x0000_i1045" alt="" style="width:468pt;height:.05pt;mso-width-percent:0;mso-height-percent:0;mso-width-percent:0;mso-height-percent:0" o:hralign="center" o:hrstd="t" o:hr="t"/>
         </w:pict>
       </w:r>
@@ -126,7 +126,7 @@
         <w:rPr>
           <w:noProof/>
         </w:rPr>
-        <w:pict w14:anchorId="7B0CEEC4">
+        <w:pict w14:anchorId="4602C37A">
           <v:rect id="_x0000_i1044" alt="" style="width:468pt;height:.05pt;mso-width-percent:0;mso-height-percent:0;mso-width-percent:0;mso-height-percent:0" o:hralign="center" o:hrstd="t" o:hr="t"/>
         </w:pict>
       </w:r>
@@ -396,7 +396,7 @@
         <w:rPr>
           <w:noProof/>
         </w:rPr>
-        <w:pict w14:anchorId="0AF1F1A4">
+        <w:pict w14:anchorId="5B598B16">
           <v:rect id="_x0000_i1043" alt="" style="width:468pt;height:.05pt;mso-width-percent:0;mso-height-percent:0;mso-width-percent:0;mso-height-percent:0" o:hralign="center" o:hrstd="t" o:hr="t"/>
         </w:pict>
       </w:r>
@@ -944,7 +944,7 @@
         <w:rPr>
           <w:noProof/>
         </w:rPr>
-        <w:pict w14:anchorId="46614226">
+        <w:pict w14:anchorId="6BD9E38C">
           <v:rect id="_x0000_i1042" alt="" style="width:468pt;height:.05pt;mso-width-percent:0;mso-height-percent:0;mso-width-percent:0;mso-height-percent:0" o:hralign="center" o:hrstd="t" o:hr="t"/>
         </w:pict>
       </w:r>
@@ -1097,7 +1097,7 @@
         <w:rPr>
           <w:noProof/>
         </w:rPr>
-        <w:pict w14:anchorId="26D30D64">
+        <w:pict w14:anchorId="6964BB9F">
           <v:rect id="_x0000_i1041" alt="" style="width:468pt;height:.05pt;mso-width-percent:0;mso-height-percent:0;mso-width-percent:0;mso-height-percent:0" o:hralign="center" o:hrstd="t" o:hr="t"/>
         </w:pict>
       </w:r>
@@ -1250,7 +1250,7 @@
         <w:rPr>
           <w:noProof/>
         </w:rPr>
-        <w:pict w14:anchorId="46B61366">
+        <w:pict w14:anchorId="3890DB23">
           <v:rect id="_x0000_i1040" alt="" style="width:468pt;height:.05pt;mso-width-percent:0;mso-height-percent:0;mso-width-percent:0;mso-height-percent:0" o:hralign="center" o:hrstd="t" o:hr="t"/>
         </w:pict>
       </w:r>
@@ -1366,7 +1366,7 @@
         <w:rPr>
           <w:noProof/>
         </w:rPr>
-        <w:pict w14:anchorId="7DAF8A27">
+        <w:pict w14:anchorId="25DFE3D9">
           <v:rect id="_x0000_i1039" alt="" style="width:468pt;height:.05pt;mso-width-percent:0;mso-height-percent:0;mso-width-percent:0;mso-height-percent:0" o:hralign="center" o:hrstd="t" o:hr="t"/>
         </w:pict>
       </w:r>
@@ -1778,7 +1778,7 @@
         <w:rPr>
           <w:noProof/>
         </w:rPr>
-        <w:pict w14:anchorId="6BFB431E">
+        <w:pict w14:anchorId="03DECDBA">
           <v:rect id="_x0000_i1038" alt="" style="width:468pt;height:.05pt;mso-width-percent:0;mso-height-percent:0;mso-width-percent:0;mso-height-percent:0" o:hralign="center" o:hrstd="t" o:hr="t"/>
         </w:pict>
       </w:r>
@@ -1997,7 +1997,7 @@
         <w:rPr>
           <w:noProof/>
         </w:rPr>
-        <w:pict w14:anchorId="2F4F4436">
+        <w:pict w14:anchorId="1B3AD944">
           <v:rect id="_x0000_i1037" alt="" style="width:468pt;height:.05pt;mso-width-percent:0;mso-height-percent:0;mso-width-percent:0;mso-height-percent:0" o:hralign="center" o:hrstd="t" o:hr="t"/>
         </w:pict>
       </w:r>
@@ -2298,7 +2298,7 @@
         <w:rPr>
           <w:noProof/>
         </w:rPr>
-        <w:pict w14:anchorId="46E8B0B2">
+        <w:pict w14:anchorId="750864DE">
           <v:rect id="_x0000_i1036" alt="" style="width:468pt;height:.05pt;mso-width-percent:0;mso-height-percent:0;mso-width-percent:0;mso-height-percent:0" o:hralign="center" o:hrstd="t" o:hr="t"/>
         </w:pict>
       </w:r>
@@ -2477,7 +2477,7 @@
         <w:rPr>
           <w:noProof/>
         </w:rPr>
-        <w:pict w14:anchorId="41373161">
+        <w:pict w14:anchorId="2CB33A76">
           <v:rect id="_x0000_i1035" alt="" style="width:468pt;height:.05pt;mso-width-percent:0;mso-height-percent:0;mso-width-percent:0;mso-height-percent:0" o:hralign="center" o:hrstd="t" o:hr="t"/>
         </w:pict>
       </w:r>
@@ -2717,7 +2717,7 @@
           <w:noProof/>
         </w:rPr>
         <w:lastRenderedPageBreak/>
-        <w:pict w14:anchorId="65FFAC39">
+        <w:pict w14:anchorId="2B698E22">
           <v:rect id="_x0000_i1034" alt="" style="width:468pt;height:.05pt;mso-width-percent:0;mso-height-percent:0;mso-width-percent:0;mso-height-percent:0" o:hralign="center" o:hrstd="t" o:hr="t"/>
         </w:pict>
       </w:r>
@@ -2982,7 +2982,7 @@
         <w:rPr>
           <w:noProof/>
         </w:rPr>
-        <w:pict w14:anchorId="35F9B6A2">
+        <w:pict w14:anchorId="623E78B6">
           <v:rect id="_x0000_i1033" alt="" style="width:468pt;height:.05pt;mso-width-percent:0;mso-height-percent:0;mso-width-percent:0;mso-height-percent:0" o:hralign="center" o:hrstd="t" o:hr="t"/>
         </w:pict>
       </w:r>
@@ -3146,7 +3146,7 @@
         <w:rPr>
           <w:noProof/>
         </w:rPr>
-        <w:pict w14:anchorId="108921D1">
+        <w:pict w14:anchorId="7D8D10F1">
           <v:rect id="_x0000_i1032" alt="" style="width:468pt;height:.05pt;mso-width-percent:0;mso-height-percent:0;mso-width-percent:0;mso-height-percent:0" o:hralign="center" o:hrstd="t" o:hr="t"/>
         </w:pict>
       </w:r>
@@ -3167,7 +3167,7 @@
         <w:pStyle w:val="FirstParagraph"/>
       </w:pPr>
       <w:r>
-        <w:t>The application may eventually provide Premium functionality through a subscription or lifetime purchase.</w:t>
+        <w:t>The application may provide Premium functionality through a subscription or lifetime purchase.</w:t>
       </w:r>
     </w:p>
     <w:p>
@@ -3349,7 +3349,7 @@
         <w:rPr>
           <w:noProof/>
         </w:rPr>
-        <w:pict w14:anchorId="41873398">
+        <w:pict w14:anchorId="03478E23">
           <v:rect id="_x0000_i1031" alt="" style="width:468pt;height:.05pt;mso-width-percent:0;mso-height-percent:0;mso-width-percent:0;mso-height-percent:0" o:hralign="center" o:hrstd="t" o:hr="t"/>
         </w:pict>
       </w:r>
@@ -3554,7 +3554,7 @@
         <w:rPr>
           <w:noProof/>
         </w:rPr>
-        <w:pict w14:anchorId="70084049">
+        <w:pict w14:anchorId="29439346">
           <v:rect id="_x0000_i1030" alt="" style="width:468pt;height:.05pt;mso-width-percent:0;mso-height-percent:0;mso-width-percent:0;mso-height-percent:0" o:hralign="center" o:hrstd="t" o:hr="t"/>
         </w:pict>
       </w:r>
@@ -3890,7 +3890,7 @@
         <w:rPr>
           <w:noProof/>
         </w:rPr>
-        <w:pict w14:anchorId="3DB12FDA">
+        <w:pict w14:anchorId="717DF2E7">
           <v:rect id="_x0000_i1029" alt="" style="width:468pt;height:.05pt;mso-width-percent:0;mso-height-percent:0;mso-width-percent:0;mso-height-percent:0" o:hralign="center" o:hrstd="t" o:hr="t"/>
         </w:pict>
       </w:r>
@@ -4044,7 +4044,7 @@
         <w:rPr>
           <w:noProof/>
         </w:rPr>
-        <w:pict w14:anchorId="3C840732">
+        <w:pict w14:anchorId="7F63D1E4">
           <v:rect id="_x0000_i1028" alt="" style="width:468pt;height:.05pt;mso-width-percent:0;mso-height-percent:0;mso-width-percent:0;mso-height-percent:0" o:hralign="center" o:hrstd="t" o:hr="t"/>
         </w:pict>
       </w:r>
@@ -4581,7 +4581,7 @@
         <w:rPr>
           <w:noProof/>
         </w:rPr>
-        <w:pict w14:anchorId="6B7CA310">
+        <w:pict w14:anchorId="6408AFE5">
           <v:rect id="_x0000_i1027" alt="" style="width:468pt;height:.05pt;mso-width-percent:0;mso-height-percent:0;mso-width-percent:0;mso-height-percent:0" o:hralign="center" o:hrstd="t" o:hr="t"/>
         </w:pict>
       </w:r>
@@ -4738,7 +4738,7 @@
         <w:rPr>
           <w:noProof/>
         </w:rPr>
-        <w:pict w14:anchorId="30723A19">
+        <w:pict w14:anchorId="4FC856AC">
           <v:rect id="_x0000_i1026" alt="" style="width:468pt;height:.05pt;mso-width-percent:0;mso-height-percent:0;mso-width-percent:0;mso-height-percent:0" o:hralign="center" o:hrstd="t" o:hr="t"/>
         </w:pict>
       </w:r>
@@ -5114,7 +5114,7 @@
         <w:rPr>
           <w:noProof/>
         </w:rPr>
-        <w:pict w14:anchorId="058EC79B">
+        <w:pict w14:anchorId="49599137">
           <v:rect id="_x0000_i1025" alt="" style="width:468pt;height:.05pt;mso-width-percent:0;mso-height-percent:0;mso-width-percent:0;mso-height-percent:0" o:hralign="center" o:hrstd="t" o:hr="t"/>
         </w:pict>
       </w:r>

</xml_diff>